<commit_message>
Add Phase 2 AI recommendation: collaborative filtering, fatigue decay, repurchase-aware profile
Adds implicit-ALS collaborative filtering (numpy fallback solver since the
implicit wheel doesn't build on this Windows/py3.12 setup), category-fatigue
decay reranking, and a multi-signal time-decay preference vector (view +
cart-add + purchase) to the recommendation service, wired through the Java
proxy and client with session/user identity on every placement.

Also fixes two issues found after real use: the CF candidate pool leaked
out-of-stock products (shrinking result lists below the requested count),
and purchase recency was weighted as the strongest signal immediately after
a buy instead of ramping up toward the product's estimated repurchase cycle.

Co-Authored-By: Claude Sonnet 5 <noreply@anthropic.com>
</commit_message>
<xml_diff>
--- a/recommendation-service/AI_Recommendation_Roadmap.docx
+++ b/recommendation-service/AI_Recommendation_Roadmap.docx
@@ -4562,6 +4562,1261 @@
       </w:pPr>
       <w:r>
         <w:t>Kiểm tra trực tiếp trên trình duyệt thật: bấm nút “thêm nhanh vào giỏ” ở mục gợi ý cho một sản phẩm còn hàng — hệ thống không còn báo hết hàng sai, chuyển đúng sang bước tiếp theo của quy trình thêm giỏ hàng bình thường.</w:t>
+      </w:r>
+    </w:p>
+    <w:p>
+      <w:pPr>
+        <w:pStyle w:val="Heading1"/>
+      </w:pPr>
+      <w:r>
+        <w:t>PHẦN III — QUY TRÌNH XÂY DỰNG MÔ HÌNH (PHASE 2)</w:t>
+      </w:r>
+    </w:p>
+    <w:p>
+      <w:pPr/>
+      <w:r>
+        <w:t>Phần này giải thích Phase 2 đã bổ sung những gì vào hệ thống gợi ý: một góc nhìn hoàn toàn mới về sở thích khách hàng (dựa trên hành vi mua sắm thay vì nội dung sản phẩm), một cơ chế “nhớ dài hạn” để tránh gợi ý bị nhàm chán, và cách ghi nhận đầy đủ hơn những gì khách đã xem/bỏ giỏ/mua. Kiến trúc tổng thể (dịch vụ Python độc lập, backend Java làm cầu nối, tự chuyển phương án dự phòng khi lỗi) giữ nguyên như Phase 1 — Phase 2 chỉ làm mô hình “thông minh” hơn, không đổi cách các thành phần hệ thống nói chuyện với nhau.</w:t>
+      </w:r>
+    </w:p>
+    <w:p>
+      <w:pPr>
+        <w:pStyle w:val="Heading2"/>
+      </w:pPr>
+      <w:r>
+        <w:t>1. Cơ chế hoạt động của mô hình</w:t>
+      </w:r>
+    </w:p>
+    <w:p>
+      <w:pPr>
+        <w:pStyle w:val="Heading3"/>
+      </w:pPr>
+      <w:r>
+        <w:t>1.1 Mô hình mới thêm vào là gì?</w:t>
+      </w:r>
+    </w:p>
+    <w:p>
+      <w:pPr/>
+      <w:r>
+        <w:t>Phase 1 mới trả lời được câu hỏi “sản phẩm này giống sản phẩm nào về nội dung” (tên, mô tả, danh mục, giá). Phase 2 bổ sung một góc nhìn khác hẳn: “những khách hàng có gu mua sắm giống nhau thường thích sản phẩm gì” — bất kể 2 sản phẩm đó có mô tả giống nhau hay không. Đây gọi là gợi ý theo hành vi cộng đồng (Collaborative Filtering), và là góc nhìn thứ 4 được cộng thêm vào 3 góc nhìn đã có (nội dung, mua kèm, phổ biến).</w:t>
+      </w:r>
+    </w:p>
+    <w:p>
+      <w:pPr/>
+      <w:r>
+        <w:t>Góc nhìn này phải chờ tới Phase 2 mới bật vì nó cần đủ số khách hàng có lịch sử mua lặp lại thì việc “so gu” giữa các khách mới có ý nghĩa — bật quá sớm khi dữ liệu còn quá thưa sẽ cho kết quả nhiễu, sai lệch. Ngưỡng dữ liệu tối thiểu (~50 khách hàng có từ 2 đơn mua trở lên) đã đạt được ở thời điểm triển khai Phase 2.</w:t>
+      </w:r>
+    </w:p>
+    <w:p>
+      <w:pPr/>
+      <w:r>
+        <w:t>Ngoài góc nhìn mới này, Phase 2 còn thêm 2 cải tiến để hệ thống “nhớ lâu hơn” và tránh nhàm chán tốt hơn: nhớ lại những gì đã từng gợi ý cho khách để không lặp lại mãi 1 vài nhóm sản phẩm quen thuộc, và ghi nhận đầy đủ hơn hành vi khách (không chỉ xem, mà cả bỏ giỏ và mua thật), mỗi loại hành vi có mức độ quan trọng và “độ nhớ lâu” khác nhau.</w:t>
+      </w:r>
+    </w:p>
+    <w:p>
+      <w:pPr>
+        <w:pStyle w:val="Heading3"/>
+      </w:pPr>
+      <w:r>
+        <w:t>1.2 Các thuật toán/cơ chế mới được áp dụng</w:t>
+      </w:r>
+    </w:p>
+    <w:p>
+      <w:pPr>
+        <w:pStyle w:val="ListBullet"/>
+      </w:pPr>
+      <w:r>
+        <w:rPr>
+          <w:b/>
+        </w:rPr>
+        <w:t xml:space="preserve">Gợi ý theo hành vi cộng đồng (Collaborative Filtering) — thuật toán ALS: </w:t>
+      </w:r>
+      <w:r>
+        <w:rPr>
+          <w:b w:val="0"/>
+        </w:rPr>
+        <w:t>mỗi khách hàng được biểu diễn bằng một dãy số thể hiện “gu sở thích”, mỗi sản phẩm cũng được biểu diễn bằng một dãy số thể hiện “đặc điểm được ưa chuộng”. Mô hình học 2 dãy số này bằng cách chỉnh đi chỉnh lại xen kẽ (cố định sản phẩm để chỉnh khách hàng cho khớp, rồi cố định khách hàng để chỉnh sản phẩm cho khớp, lặp lại nhiều vòng) sao cho khi nhân dãy số của 1 khách với dãy số của 1 sản phẩm, kết quả càng gần với việc khách đó có thực sự tương tác với sản phẩm đó hay không. Dùng để cá nhân hoá trang chủ (so khách với khách) và tìm sản phẩm “tương tự theo hành vi” (so sản phẩm với sản phẩm).</w:t>
+      </w:r>
+    </w:p>
+    <w:p>
+      <w:pPr>
+        <w:pStyle w:val="ListBullet"/>
+      </w:pPr>
+      <w:r>
+        <w:rPr>
+          <w:b/>
+        </w:rPr>
+        <w:t xml:space="preserve">Trọng số hành vi theo thời gian: </w:t>
+      </w:r>
+      <w:r>
+        <w:rPr>
+          <w:b w:val="0"/>
+        </w:rPr>
+        <w:t>mỗi lượt mua/bỏ giỏ/xem được tính điểm “quan trọng” khác nhau (mua thật quan trọng nhất, kế đến bỏ giỏ, thấp nhất là xem) và điểm này giảm dần theo thời gian — hành vi càng gần đây càng ảnh hưởng nhiều, hành vi cũ dần bị “quên”.</w:t>
+      </w:r>
+    </w:p>
+    <w:p>
+      <w:pPr>
+        <w:pStyle w:val="ListBullet"/>
+      </w:pPr>
+      <w:r>
+        <w:rPr>
+          <w:b/>
+        </w:rPr>
+        <w:t xml:space="preserve">Chống nhàm chán theo lịch sử hiển thị (category-fatigue decay): </w:t>
+      </w:r>
+      <w:r>
+        <w:rPr>
+          <w:b w:val="0"/>
+        </w:rPr>
+        <w:t>khác với MMR ở Phase 1 (chỉ so sánh trong 1 lần gợi ý duy nhất), cơ chế này nhớ lại nhiều lần gợi ý trước đó của cùng 1 khách. Nếu 1 danh mục sản phẩm đã được cho xem nhiều lần gần đây mà khách không bấm vào, điểm của các sản phẩm cùng danh mục đó sẽ bị hạ thấp ở lần gợi ý tiếp theo — giúp phá vỡ vòng lặp “cứ hiện hoài 1 vài loại sản phẩm quen thuộc”.</w:t>
+      </w:r>
+    </w:p>
+    <w:p>
+      <w:pPr>
+        <w:pStyle w:val="ListBullet"/>
+      </w:pPr>
+      <w:r>
+        <w:rPr>
+          <w:b/>
+        </w:rPr>
+        <w:t xml:space="preserve">Lịch trình học lại linh hoạt: </w:t>
+      </w:r>
+      <w:r>
+        <w:rPr>
+          <w:b w:val="0"/>
+        </w:rPr>
+        <w:t>khi dữ liệu còn ít, mô hình hành vi cộng đồng học lại mỗi đêm như các phần khác; khi dữ liệu đã nhiều, việc học lại mỗi đêm không còn cần thiết (kết quả gần như không đổi) nên hệ thống tự động giãn ra, chỉ học lại khi mô hình cũ đã quá 7 ngày tuổi — tiết kiệm tài nguyên mà không ảnh hưởng chất lượng gợi ý.</w:t>
+      </w:r>
+    </w:p>
+    <w:p>
+      <w:pPr>
+        <w:jc w:val="center"/>
+      </w:pPr>
+      <w:r>
+        <w:drawing>
+          <wp:inline xmlns:a="http://schemas.openxmlformats.org/drawingml/2006/main" xmlns:pic="http://schemas.openxmlformats.org/drawingml/2006/picture">
+            <wp:extent cx="5760720" cy="3129396"/>
+            <wp:docPr id="3" name="Picture 3"/>
+            <wp:cNvGraphicFramePr>
+              <a:graphicFrameLocks noChangeAspect="1"/>
+            </wp:cNvGraphicFramePr>
+            <a:graphic>
+              <a:graphicData uri="http://schemas.openxmlformats.org/drawingml/2006/picture">
+                <pic:pic>
+                  <pic:nvPicPr>
+                    <pic:cNvPr id="0" name="diagram_als_learning.png"/>
+                    <pic:cNvPicPr/>
+                  </pic:nvPicPr>
+                  <pic:blipFill>
+                    <a:blip r:embed="rId11"/>
+                    <a:stretch>
+                      <a:fillRect/>
+                    </a:stretch>
+                  </pic:blipFill>
+                  <pic:spPr>
+                    <a:xfrm>
+                      <a:off x="0" y="0"/>
+                      <a:ext cx="5760720" cy="3129396"/>
+                    </a:xfrm>
+                    <a:prstGeom prst="rect"/>
+                  </pic:spPr>
+                </pic:pic>
+              </a:graphicData>
+            </a:graphic>
+          </wp:inline>
+        </w:drawing>
+      </w:r>
+    </w:p>
+    <w:p>
+      <w:pPr>
+        <w:pStyle w:val="Caption"/>
+        <w:jc w:val="center"/>
+      </w:pPr>
+      <w:r>
+        <w:t>Sơ đồ 4 — Cách mô hình học “gu sở thích” từ hành vi mua/xem/giỏ hàng</w:t>
+      </w:r>
+    </w:p>
+    <w:p>
+      <w:pPr>
+        <w:pStyle w:val="Heading3"/>
+      </w:pPr>
+      <w:r>
+        <w:t>1.3 Quy trình mô hình tạo ra một danh sách gợi ý (cập nhật)</w:t>
+      </w:r>
+    </w:p>
+    <w:p>
+      <w:pPr/>
+      <w:r>
+        <w:t>So với Phase 1, quy trình có thêm 1 nguồn ứng viên và 1 bước lọc mới, thực hiện tuần tự 5 bước:</w:t>
+      </w:r>
+    </w:p>
+    <w:p>
+      <w:pPr>
+        <w:pStyle w:val="ListNumber"/>
+      </w:pPr>
+      <w:r>
+        <w:t>Lấy song song 4 danh sách ứng viên (nội dung, mua kèm, phổ biến, và MỚI: hành vi cộng đồng).</w:t>
+      </w:r>
+    </w:p>
+    <w:p>
+      <w:pPr>
+        <w:pStyle w:val="ListNumber"/>
+      </w:pPr>
+      <w:r>
+        <w:t>Trộn 4 danh sách theo tỉ trọng phù hợp với vị trí hiển thị, ra một danh sách chung.</w:t>
+      </w:r>
+    </w:p>
+    <w:p>
+      <w:pPr>
+        <w:pStyle w:val="ListNumber"/>
+      </w:pPr>
+      <w:r>
+        <w:t>MỚI: hạ điểm các sản phẩm thuộc danh mục mà khách đã “xem hoài mà không bấm” gần đây (chống nhàm chán theo lịch sử hiển thị).</w:t>
+      </w:r>
+    </w:p>
+    <w:p>
+      <w:pPr>
+        <w:pStyle w:val="ListNumber"/>
+      </w:pPr>
+      <w:r>
+        <w:t>Đưa danh sách qua bước chống nhàm chán trong-1-lần-hiển-thị (MMR) như Phase 1, chọn ra 6-12 sản phẩm cuối cùng.</w:t>
+      </w:r>
+    </w:p>
+    <w:p>
+      <w:pPr>
+        <w:pStyle w:val="ListNumber"/>
+      </w:pPr>
+      <w:r>
+        <w:t>Trả về danh sách cuối cùng (chỉ gồm mã sản phẩm + điểm số) cho hệ thống chính.</w:t>
+      </w:r>
+    </w:p>
+    <w:p>
+      <w:pPr>
+        <w:jc w:val="center"/>
+      </w:pPr>
+      <w:r>
+        <w:drawing>
+          <wp:inline xmlns:a="http://schemas.openxmlformats.org/drawingml/2006/main" xmlns:pic="http://schemas.openxmlformats.org/drawingml/2006/picture">
+            <wp:extent cx="5760720" cy="3121757"/>
+            <wp:docPr id="4" name="Picture 4"/>
+            <wp:cNvGraphicFramePr>
+              <a:graphicFrameLocks noChangeAspect="1"/>
+            </wp:cNvGraphicFramePr>
+            <a:graphic>
+              <a:graphicData uri="http://schemas.openxmlformats.org/drawingml/2006/picture">
+                <pic:pic>
+                  <pic:nvPicPr>
+                    <pic:cNvPr id="0" name="diagram_pipeline_phase2.png"/>
+                    <pic:cNvPicPr/>
+                  </pic:nvPicPr>
+                  <pic:blipFill>
+                    <a:blip r:embed="rId12"/>
+                    <a:stretch>
+                      <a:fillRect/>
+                    </a:stretch>
+                  </pic:blipFill>
+                  <pic:spPr>
+                    <a:xfrm>
+                      <a:off x="0" y="0"/>
+                      <a:ext cx="5760720" cy="3121757"/>
+                    </a:xfrm>
+                    <a:prstGeom prst="rect"/>
+                  </pic:spPr>
+                </pic:pic>
+              </a:graphicData>
+            </a:graphic>
+          </wp:inline>
+        </w:drawing>
+      </w:r>
+    </w:p>
+    <w:p>
+      <w:pPr>
+        <w:pStyle w:val="Caption"/>
+        <w:jc w:val="center"/>
+      </w:pPr>
+      <w:r>
+        <w:t>Sơ đồ 3 — Quy trình mô hình tạo ra một danh sách gợi ý (Phase 2)</w:t>
+      </w:r>
+    </w:p>
+    <w:p>
+      <w:pPr>
+        <w:pStyle w:val="Heading3"/>
+      </w:pPr>
+      <w:r>
+        <w:t>1.4 Bộ dữ liệu cần thiết bổ sung</w:t>
+      </w:r>
+    </w:p>
+    <w:p>
+      <w:pPr>
+        <w:pStyle w:val="ListBullet"/>
+      </w:pPr>
+      <w:r>
+        <w:t>Dữ liệu bỏ vào giỏ hàng (thêm/bớt/đổi số lượng) — dùng cho học hành vi cộng đồng và vector sở thích.</w:t>
+      </w:r>
+    </w:p>
+    <w:p>
+      <w:pPr>
+        <w:pStyle w:val="ListBullet"/>
+      </w:pPr>
+      <w:r>
+        <w:t>Dữ liệu mua hàng thật (đã có từ Phase 1, nay dùng thêm cho học hành vi cộng đồng — tín hiệu trọng số cao nhất).</w:t>
+      </w:r>
+    </w:p>
+    <w:p>
+      <w:pPr>
+        <w:pStyle w:val="ListBullet"/>
+      </w:pPr>
+      <w:r>
+        <w:t>Lịch sử các lần đã hiển thị gợi ý cho khách trước đó (đã thu thập từ Phase 0) — dùng để tính chống nhàm chán theo lịch sử.</w:t>
+      </w:r>
+    </w:p>
+    <w:p>
+      <w:pPr>
+        <w:pStyle w:val="Heading3"/>
+      </w:pPr>
+      <w:r>
+        <w:t>1.5 Mô hình học lại theo chu kỳ nào? (cập nhật)</w:t>
+      </w:r>
+    </w:p>
+    <w:p>
+      <w:pPr/>
+      <w:r>
+        <w:t>Phần nội dung/mua kèm/phổ biến vẫn học lại mỗi đêm lúc 2 giờ sáng như Phase 1. Riêng phần hành vi cộng đồng có thêm quy tắc linh hoạt: nếu khối lượng dữ liệu còn nhỏ, học lại mỗi đêm cùng các phần khác; khi khối lượng đã đủ lớn, chỉ học lại khi mô hình hiện tại đã quá 7 ngày tuổi, còn lại giữ nguyên mô hình cũ. Việc “chuyển giao” giữa mô hình cũ và mới luôn diễn ra trọn vẹn cùng lúc, không có lúc nào hệ thống ở trạng thái nửa cũ nửa mới.</w:t>
+      </w:r>
+    </w:p>
+    <w:p>
+      <w:pPr>
+        <w:pStyle w:val="Heading3"/>
+      </w:pPr>
+      <w:r>
+        <w:t>1.6 Mô hình tương tác với hệ thống như thế nào?</w:t>
+      </w:r>
+    </w:p>
+    <w:p>
+      <w:pPr/>
+      <w:r>
+        <w:t>Kiến trúc tổng thể giữ nguyên như Sơ đồ 1 ở Phase 1: dịch vụ gợi ý vẫn là 1 dịch vụ độc lập, backend chính vẫn là cầu nối duy nhất, vẫn có thời gian chờ giới hạn và tự chuyển sang phương án dự phòng khi lỗi. Phase 2 chỉ bổ sung 1 chi tiết nhỏ: ở cả 3 vị trí hiển thị, backend chính giờ gửi kèm thêm mã khách hàng (nếu đã đăng nhập) và mã phiên truy cập sang dịch vụ gợi ý — trước đây trang giỏ hàng và trang chi tiết sản phẩm chưa gửi thông tin này — để dịch vụ gợi ý biết chính xác nên áp dụng hành vi cộng đồng và chống nhàm chán cho đúng khách nào.</w:t>
+      </w:r>
+    </w:p>
+    <w:p>
+      <w:pPr>
+        <w:pStyle w:val="Heading2"/>
+      </w:pPr>
+      <w:r>
+        <w:t>2. Các bước đã thực hiện trong Phase 2</w:t>
+      </w:r>
+    </w:p>
+    <w:p>
+      <w:pPr/>
+      <w:r>
+        <w:t>Dưới đây là các bước triển khai thực tế, theo đúng thứ tự đã thực hiện, kèm đoạn mã quan trọng nhất của mỗi bước và mục đích của nó.</w:t>
+      </w:r>
+    </w:p>
+    <w:p>
+      <w:pPr>
+        <w:pStyle w:val="Heading3"/>
+      </w:pPr>
+      <w:r>
+        <w:t>Bước 1 — Tính “mức độ quan trọng” của mỗi hành vi theo thời gian</w:t>
+      </w:r>
+    </w:p>
+    <w:p>
+      <w:pPr/>
+      <w:r>
+        <w:t>Trước khi học mô hình, mỗi lượt mua/bỏ giỏ/xem giữa 1 khách và 1 sản phẩm được gộp lại thành 1 con số duy nhất, thể hiện cả loại hành vi lẫn độ mới của hành vi đó.</w:t>
+      </w:r>
+    </w:p>
+    <w:tbl>
+      <w:tblPr>
+        <w:tblW w:type="auto" w:w="0"/>
+        <w:tblLook w:firstColumn="1" w:firstRow="1" w:lastColumn="0" w:lastRow="0" w:noHBand="0" w:noVBand="1" w:val="04A0"/>
+        <w:tblLayout w:type="autofit"/>
+      </w:tblPr>
+      <w:tblGrid>
+        <w:gridCol w:w="8640"/>
+      </w:tblGrid>
+      <w:tr>
+        <w:tc>
+          <w:tcPr>
+            <w:tcW w:type="dxa" w:w="8640"/>
+            <w:shd w:val="clear" w:color="auto" w:fill="F3F6F4"/>
+            <w:tcBorders>
+              <w:top w:val="single" w:sz="4" w:space="0" w:color="C7D3CB"/>
+              <w:left w:val="single" w:sz="4" w:space="0" w:color="C7D3CB"/>
+              <w:bottom w:val="single" w:sz="4" w:space="0" w:color="C7D3CB"/>
+              <w:right w:val="single" w:sz="4" w:space="0" w:color="C7D3CB"/>
+            </w:tcBorders>
+          </w:tcPr>
+          <w:p>
+            <w:pPr>
+              <w:spacing w:before="40" w:after="40"/>
+            </w:pPr>
+            <w:r>
+              <w:rPr>
+                <w:rFonts w:ascii="Consolas" w:hAnsi="Consolas"/>
+                <w:color w:val="2A3831"/>
+                <w:sz w:val="18"/>
+              </w:rPr>
+              <w:t># Mua hàng quan trọng nhất và được nhớ lâu nhất (30 ngày);</w:t>
+            </w:r>
+            <w:r>
+              <w:rPr>
+                <w:rFonts w:ascii="Consolas" w:hAnsi="Consolas"/>
+                <w:color w:val="2A3831"/>
+                <w:sz w:val="18"/>
+              </w:rPr>
+              <w:br/>
+              <w:t># xem chỉ là tín hiệu yếu và bị quên nhanh (7 ngày)</w:t>
+            </w:r>
+            <w:r>
+              <w:rPr>
+                <w:rFonts w:ascii="Consolas" w:hAnsi="Consolas"/>
+                <w:color w:val="2A3831"/>
+                <w:sz w:val="18"/>
+              </w:rPr>
+              <w:br/>
+              <w:t>diem_hanh_vi = (</w:t>
+            </w:r>
+            <w:r>
+              <w:rPr>
+                <w:rFonts w:ascii="Consolas" w:hAnsi="Consolas"/>
+                <w:color w:val="2A3831"/>
+                <w:sz w:val="18"/>
+              </w:rPr>
+              <w:br/>
+              <w:t xml:space="preserve">    5.0 * exp(-so_ngay_da_qua_khi_mua * ln2 / 30)</w:t>
+            </w:r>
+            <w:r>
+              <w:rPr>
+                <w:rFonts w:ascii="Consolas" w:hAnsi="Consolas"/>
+                <w:color w:val="2A3831"/>
+                <w:sz w:val="18"/>
+              </w:rPr>
+              <w:br/>
+              <w:t xml:space="preserve">    + 2.0 * exp(-so_ngay_da_qua_khi_bo_gio * ln2 / 14)</w:t>
+            </w:r>
+            <w:r>
+              <w:rPr>
+                <w:rFonts w:ascii="Consolas" w:hAnsi="Consolas"/>
+                <w:color w:val="2A3831"/>
+                <w:sz w:val="18"/>
+              </w:rPr>
+              <w:br/>
+              <w:t xml:space="preserve">    + 1.0 * exp(-so_ngay_da_qua_khi_xem * ln2 / 7)</w:t>
+            </w:r>
+            <w:r>
+              <w:rPr>
+                <w:rFonts w:ascii="Consolas" w:hAnsi="Consolas"/>
+                <w:color w:val="2A3831"/>
+                <w:sz w:val="18"/>
+              </w:rPr>
+              <w:br/>
+              <w:t>)</w:t>
+            </w:r>
+          </w:p>
+        </w:tc>
+      </w:tr>
+    </w:tbl>
+    <w:p>
+      <w:pPr/>
+    </w:p>
+    <w:p>
+      <w:pPr>
+        <w:pStyle w:val="Heading3"/>
+      </w:pPr>
+      <w:r>
+        <w:t>Bước 2 — Học “gu sở thích” bằng ALS, có ngưỡng an toàn</w:t>
+      </w:r>
+    </w:p>
+    <w:p>
+      <w:pPr/>
+      <w:r>
+        <w:t>Trước khi học, kiểm tra đã đủ số khách hàng và số sản phẩm có hành vi hay chưa; nếu chưa đủ thì bỏ qua hoàn toàn, không suy diễn ẩu (giống cơ chế “im lặng” của gợi ý mua kèm ở Phase 1). Nếu đủ, học xen kẽ 2 dãy số (khách hàng/sản phẩm) qua nhiều vòng cho tới khi ổn định. Thư viện học ALS tiêu chuẩn không cài đặt được trên máy chủ đang dùng (Windows) nên một phiên bản thay thế tương đương đã được tự viết để đảm bảo hệ thống luôn chạy được.</w:t>
+      </w:r>
+    </w:p>
+    <w:tbl>
+      <w:tblPr>
+        <w:tblW w:type="auto" w:w="0"/>
+        <w:tblLook w:firstColumn="1" w:firstRow="1" w:lastColumn="0" w:lastRow="0" w:noHBand="0" w:noVBand="1" w:val="04A0"/>
+        <w:tblLayout w:type="autofit"/>
+      </w:tblPr>
+      <w:tblGrid>
+        <w:gridCol w:w="8640"/>
+      </w:tblGrid>
+      <w:tr>
+        <w:tc>
+          <w:tcPr>
+            <w:tcW w:type="dxa" w:w="8640"/>
+            <w:shd w:val="clear" w:color="auto" w:fill="F3F6F4"/>
+            <w:tcBorders>
+              <w:top w:val="single" w:sz="4" w:space="0" w:color="C7D3CB"/>
+              <w:left w:val="single" w:sz="4" w:space="0" w:color="C7D3CB"/>
+              <w:bottom w:val="single" w:sz="4" w:space="0" w:color="C7D3CB"/>
+              <w:right w:val="single" w:sz="4" w:space="0" w:color="C7D3CB"/>
+            </w:tcBorders>
+          </w:tcPr>
+          <w:p>
+            <w:pPr>
+              <w:spacing w:before="40" w:after="40"/>
+            </w:pPr>
+            <w:r>
+              <w:rPr>
+                <w:rFonts w:ascii="Consolas" w:hAnsi="Consolas"/>
+                <w:color w:val="2A3831"/>
+                <w:sz w:val="18"/>
+              </w:rPr>
+              <w:t>if so_khach_du_du_lieu &lt; 50 or so_san_pham_lien_quan &lt; 20:</w:t>
+            </w:r>
+            <w:r>
+              <w:rPr>
+                <w:rFonts w:ascii="Consolas" w:hAnsi="Consolas"/>
+                <w:color w:val="2A3831"/>
+                <w:sz w:val="18"/>
+              </w:rPr>
+              <w:br/>
+              <w:t xml:space="preserve">    return None   # "im lặng" — chưa đủ dữ liệu, chưa bật hành vi cộng đồng</w:t>
+            </w:r>
+            <w:r>
+              <w:rPr>
+                <w:rFonts w:ascii="Consolas" w:hAnsi="Consolas"/>
+                <w:color w:val="2A3831"/>
+                <w:sz w:val="18"/>
+              </w:rPr>
+              <w:br/>
+              <w:t/>
+            </w:r>
+            <w:r>
+              <w:rPr>
+                <w:rFonts w:ascii="Consolas" w:hAnsi="Consolas"/>
+                <w:color w:val="2A3831"/>
+                <w:sz w:val="18"/>
+              </w:rPr>
+              <w:br/>
+              <w:t>for vong_lap in range(so_vong_lap):</w:t>
+            </w:r>
+            <w:r>
+              <w:rPr>
+                <w:rFonts w:ascii="Consolas" w:hAnsi="Consolas"/>
+                <w:color w:val="2A3831"/>
+                <w:sz w:val="18"/>
+              </w:rPr>
+              <w:br/>
+              <w:t xml:space="preserve">    vector_khach = giai_theo(vector_san_pham, diem_hanh_vi)</w:t>
+            </w:r>
+            <w:r>
+              <w:rPr>
+                <w:rFonts w:ascii="Consolas" w:hAnsi="Consolas"/>
+                <w:color w:val="2A3831"/>
+                <w:sz w:val="18"/>
+              </w:rPr>
+              <w:br/>
+              <w:t xml:space="preserve">    vector_san_pham = giai_theo(vector_khach, diem_hanh_vi)</w:t>
+            </w:r>
+          </w:p>
+        </w:tc>
+      </w:tr>
+    </w:tbl>
+    <w:p>
+      <w:pPr/>
+    </w:p>
+    <w:p>
+      <w:pPr>
+        <w:pStyle w:val="Heading3"/>
+      </w:pPr>
+      <w:r>
+        <w:t>Bước 3 — Suy ra “sản phẩm tương tự theo hành vi” và “gợi ý cá nhân hoá”</w:t>
+      </w:r>
+    </w:p>
+    <w:p>
+      <w:pPr/>
+      <w:r>
+        <w:t>Từ 2 dãy số đã học ở bước trên, so sánh độ giống nhau giữa 2 sản phẩm (dùng cho mục “sản phẩm tương tự” và giỏ hàng) hoặc nhân dãy số của 1 khách với toàn bộ sản phẩm để xếp hạng gợi ý cá nhân (dùng cho trang chủ).</w:t>
+      </w:r>
+    </w:p>
+    <w:tbl>
+      <w:tblPr>
+        <w:tblW w:type="auto" w:w="0"/>
+        <w:tblLook w:firstColumn="1" w:firstRow="1" w:lastColumn="0" w:lastRow="0" w:noHBand="0" w:noVBand="1" w:val="04A0"/>
+        <w:tblLayout w:type="autofit"/>
+      </w:tblPr>
+      <w:tblGrid>
+        <w:gridCol w:w="8640"/>
+      </w:tblGrid>
+      <w:tr>
+        <w:tc>
+          <w:tcPr>
+            <w:tcW w:type="dxa" w:w="8640"/>
+            <w:shd w:val="clear" w:color="auto" w:fill="F3F6F4"/>
+            <w:tcBorders>
+              <w:top w:val="single" w:sz="4" w:space="0" w:color="C7D3CB"/>
+              <w:left w:val="single" w:sz="4" w:space="0" w:color="C7D3CB"/>
+              <w:bottom w:val="single" w:sz="4" w:space="0" w:color="C7D3CB"/>
+              <w:right w:val="single" w:sz="4" w:space="0" w:color="C7D3CB"/>
+            </w:tcBorders>
+          </w:tcPr>
+          <w:p>
+            <w:pPr>
+              <w:spacing w:before="40" w:after="40"/>
+            </w:pPr>
+            <w:r>
+              <w:rPr>
+                <w:rFonts w:ascii="Consolas" w:hAnsi="Consolas"/>
+                <w:color w:val="2A3831"/>
+                <w:sz w:val="18"/>
+              </w:rPr>
+              <w:t>do_giong_hanh_vi(sp_a, sp_b) = cosine(vector_san_pham[sp_a], vector_san_pham[sp_b])</w:t>
+            </w:r>
+            <w:r>
+              <w:rPr>
+                <w:rFonts w:ascii="Consolas" w:hAnsi="Consolas"/>
+                <w:color w:val="2A3831"/>
+                <w:sz w:val="18"/>
+              </w:rPr>
+              <w:br/>
+              <w:t>diem_ca_nhan_hoa[san_pham] = vector_khach . vector_san_pham[san_pham]</w:t>
+            </w:r>
+          </w:p>
+        </w:tc>
+      </w:tr>
+    </w:tbl>
+    <w:p>
+      <w:pPr/>
+    </w:p>
+    <w:p>
+      <w:pPr>
+        <w:pStyle w:val="Heading3"/>
+      </w:pPr>
+      <w:r>
+        <w:t>Bước 4 — Trộn thêm nguồn hành vi cộng đồng vào bước trộn nguồn sẵn có</w:t>
+      </w:r>
+    </w:p>
+    <w:p>
+      <w:pPr/>
+      <w:r>
+        <w:t>Thêm 1 nguồn nữa vào bước trộn nguồn (Blend) đã có sẵn từ Phase 1, mỗi vị trí hiển thị có tỉ trọng riêng cho nguồn mới này — không cần sửa lại logic trộn, chỉ cần thêm nguồn vào danh sách.</w:t>
+      </w:r>
+    </w:p>
+    <w:tbl>
+      <w:tblPr>
+        <w:tblW w:type="auto" w:w="0"/>
+        <w:tblLook w:firstColumn="1" w:firstRow="1" w:lastColumn="0" w:lastRow="0" w:noHBand="0" w:noVBand="1" w:val="04A0"/>
+        <w:tblLayout w:type="autofit"/>
+      </w:tblPr>
+      <w:tblGrid>
+        <w:gridCol w:w="8640"/>
+      </w:tblGrid>
+      <w:tr>
+        <w:tc>
+          <w:tcPr>
+            <w:tcW w:type="dxa" w:w="8640"/>
+            <w:shd w:val="clear" w:color="auto" w:fill="F3F6F4"/>
+            <w:tcBorders>
+              <w:top w:val="single" w:sz="4" w:space="0" w:color="C7D3CB"/>
+              <w:left w:val="single" w:sz="4" w:space="0" w:color="C7D3CB"/>
+              <w:bottom w:val="single" w:sz="4" w:space="0" w:color="C7D3CB"/>
+              <w:right w:val="single" w:sz="4" w:space="0" w:color="C7D3CB"/>
+            </w:tcBorders>
+          </w:tcPr>
+          <w:p>
+            <w:pPr>
+              <w:spacing w:before="40" w:after="40"/>
+            </w:pPr>
+            <w:r>
+              <w:rPr>
+                <w:rFonts w:ascii="Consolas" w:hAnsi="Consolas"/>
+                <w:color w:val="2A3831"/>
+                <w:sz w:val="18"/>
+              </w:rPr>
+              <w:t>nguon_goi_y["hanh_vi_cong_dong"] = diem_ca_nhan_hoa   # hoặc do_giong_hanh_vi</w:t>
+            </w:r>
+            <w:r>
+              <w:rPr>
+                <w:rFonts w:ascii="Consolas" w:hAnsi="Consolas"/>
+                <w:color w:val="2A3831"/>
+                <w:sz w:val="18"/>
+              </w:rPr>
+              <w:br/>
+              <w:t>trong_so["hanh_vi_cong_dong"] = trong_so_theo_vi_tri_hien_thi</w:t>
+            </w:r>
+          </w:p>
+        </w:tc>
+      </w:tr>
+    </w:tbl>
+    <w:p>
+      <w:pPr/>
+    </w:p>
+    <w:p>
+      <w:pPr>
+        <w:pStyle w:val="Heading3"/>
+      </w:pPr>
+      <w:r>
+        <w:t>Bước 5 — Chống nhàm chán theo lịch sử hiển thị</w:t>
+      </w:r>
+    </w:p>
+    <w:p>
+      <w:pPr/>
+      <w:r>
+        <w:t>Sau bước trộn nguồn, tính “điểm nhàm chán” cho từng danh mục dựa trên các lần đã hiển thị gần đây (14 ngày) mà khách không bấm vào — càng gần đây càng ảnh hưởng nhiều — rồi hạ điểm các sản phẩm thuộc danh mục đó trước khi đưa qua bước chống nhàm chán MMR.</w:t>
+      </w:r>
+    </w:p>
+    <w:tbl>
+      <w:tblPr>
+        <w:tblW w:type="auto" w:w="0"/>
+        <w:tblLook w:firstColumn="1" w:firstRow="1" w:lastColumn="0" w:lastRow="0" w:noHBand="0" w:noVBand="1" w:val="04A0"/>
+        <w:tblLayout w:type="autofit"/>
+      </w:tblPr>
+      <w:tblGrid>
+        <w:gridCol w:w="8640"/>
+      </w:tblGrid>
+      <w:tr>
+        <w:tc>
+          <w:tcPr>
+            <w:tcW w:type="dxa" w:w="8640"/>
+            <w:shd w:val="clear" w:color="auto" w:fill="F3F6F4"/>
+            <w:tcBorders>
+              <w:top w:val="single" w:sz="4" w:space="0" w:color="C7D3CB"/>
+              <w:left w:val="single" w:sz="4" w:space="0" w:color="C7D3CB"/>
+              <w:bottom w:val="single" w:sz="4" w:space="0" w:color="C7D3CB"/>
+              <w:right w:val="single" w:sz="4" w:space="0" w:color="C7D3CB"/>
+            </w:tcBorders>
+          </w:tcPr>
+          <w:p>
+            <w:pPr>
+              <w:spacing w:before="40" w:after="40"/>
+            </w:pPr>
+            <w:r>
+              <w:rPr>
+                <w:rFonts w:ascii="Consolas" w:hAnsi="Consolas"/>
+                <w:color w:val="2A3831"/>
+                <w:sz w:val="18"/>
+              </w:rPr>
+              <w:t>diem_nham_chan[danh_muc] += exp(-so_ngay_da_qua * ln2 / 7)  # mỗi lần đã hiển thị mà không bấm</w:t>
+            </w:r>
+            <w:r>
+              <w:rPr>
+                <w:rFonts w:ascii="Consolas" w:hAnsi="Consolas"/>
+                <w:color w:val="2A3831"/>
+                <w:sz w:val="18"/>
+              </w:rPr>
+              <w:br/>
+              <w:t/>
+            </w:r>
+            <w:r>
+              <w:rPr>
+                <w:rFonts w:ascii="Consolas" w:hAnsi="Consolas"/>
+                <w:color w:val="2A3831"/>
+                <w:sz w:val="18"/>
+              </w:rPr>
+              <w:br/>
+              <w:t>diem_sau_phat = diem_truoc_phat / (1 + 0.15 * diem_nham_chan[danh_muc_cua_san_pham])</w:t>
+            </w:r>
+          </w:p>
+        </w:tc>
+      </w:tr>
+    </w:tbl>
+    <w:p>
+      <w:pPr/>
+    </w:p>
+    <w:p>
+      <w:pPr>
+        <w:pStyle w:val="Heading3"/>
+      </w:pPr>
+      <w:r>
+        <w:t>Bước 6 — Mở rộng vector sở thích trang chủ sang nhiều loại hành vi</w:t>
+      </w:r>
+    </w:p>
+    <w:p>
+      <w:pPr/>
+      <w:r>
+        <w:t>Trước đây (Phase 1), trang chủ chỉ tính điểm ưu tiên dựa trên lịch sử xem. Nay cộng thêm lịch sử bỏ giỏ và mua thật — mỗi loại vẫn giữ công thức “càng gần đây càng ảnh hưởng nhiều” nhưng có tốc độ quên riêng (mua thật nhớ lâu nhất, xem quên nhanh nhất).</w:t>
+      </w:r>
+    </w:p>
+    <w:tbl>
+      <w:tblPr>
+        <w:tblW w:type="auto" w:w="0"/>
+        <w:tblLook w:firstColumn="1" w:firstRow="1" w:lastColumn="0" w:lastRow="0" w:noHBand="0" w:noVBand="1" w:val="04A0"/>
+        <w:tblLayout w:type="autofit"/>
+      </w:tblPr>
+      <w:tblGrid>
+        <w:gridCol w:w="8640"/>
+      </w:tblGrid>
+      <w:tr>
+        <w:tc>
+          <w:tcPr>
+            <w:tcW w:type="dxa" w:w="8640"/>
+            <w:shd w:val="clear" w:color="auto" w:fill="F3F6F4"/>
+            <w:tcBorders>
+              <w:top w:val="single" w:sz="4" w:space="0" w:color="C7D3CB"/>
+              <w:left w:val="single" w:sz="4" w:space="0" w:color="C7D3CB"/>
+              <w:bottom w:val="single" w:sz="4" w:space="0" w:color="C7D3CB"/>
+              <w:right w:val="single" w:sz="4" w:space="0" w:color="C7D3CB"/>
+            </w:tcBorders>
+          </w:tcPr>
+          <w:p>
+            <w:pPr>
+              <w:spacing w:before="40" w:after="40"/>
+            </w:pPr>
+            <w:r>
+              <w:rPr>
+                <w:rFonts w:ascii="Consolas" w:hAnsi="Consolas"/>
+                <w:color w:val="2A3831"/>
+                <w:sz w:val="18"/>
+              </w:rPr>
+              <w:t>trong_so = trong_so_theo_loai_hanh_vi * exp(-so_gio_da_qua / toc_do_quen_theo_loai_hanh_vi)</w:t>
+            </w:r>
+            <w:r>
+              <w:rPr>
+                <w:rFonts w:ascii="Consolas" w:hAnsi="Consolas"/>
+                <w:color w:val="2A3831"/>
+                <w:sz w:val="18"/>
+              </w:rPr>
+              <w:br/>
+              <w:t>diem[san_pham_ung_vien] += trong_so * do_giong(san_pham_da_tuong_tac, san_pham_ung_vien)</w:t>
+            </w:r>
+          </w:p>
+        </w:tc>
+      </w:tr>
+    </w:tbl>
+    <w:p>
+      <w:pPr/>
+    </w:p>
+    <w:p>
+      <w:pPr>
+        <w:pStyle w:val="Heading3"/>
+      </w:pPr>
+      <w:r>
+        <w:t>Bước 7 — Lịch trình học lại linh hoạt theo khối lượng dữ liệu</w:t>
+      </w:r>
+    </w:p>
+    <w:p>
+      <w:pPr/>
+      <w:r>
+        <w:t>Trước khi học lại mỗi đêm, hệ thống tự kiểm tra khối lượng dữ liệu hành vi hiện có và tuổi của mô hình đang chạy để quyết định có cần học lại đêm nay hay không.</w:t>
+      </w:r>
+    </w:p>
+    <w:tbl>
+      <w:tblPr>
+        <w:tblW w:type="auto" w:w="0"/>
+        <w:tblLook w:firstColumn="1" w:firstRow="1" w:lastColumn="0" w:lastRow="0" w:noHBand="0" w:noVBand="1" w:val="04A0"/>
+        <w:tblLayout w:type="autofit"/>
+      </w:tblPr>
+      <w:tblGrid>
+        <w:gridCol w:w="8640"/>
+      </w:tblGrid>
+      <w:tr>
+        <w:tc>
+          <w:tcPr>
+            <w:tcW w:type="dxa" w:w="8640"/>
+            <w:shd w:val="clear" w:color="auto" w:fill="F3F6F4"/>
+            <w:tcBorders>
+              <w:top w:val="single" w:sz="4" w:space="0" w:color="C7D3CB"/>
+              <w:left w:val="single" w:sz="4" w:space="0" w:color="C7D3CB"/>
+              <w:bottom w:val="single" w:sz="4" w:space="0" w:color="C7D3CB"/>
+              <w:right w:val="single" w:sz="4" w:space="0" w:color="C7D3CB"/>
+            </w:tcBorders>
+          </w:tcPr>
+          <w:p>
+            <w:pPr>
+              <w:spacing w:before="40" w:after="40"/>
+            </w:pPr>
+            <w:r>
+              <w:rPr>
+                <w:rFonts w:ascii="Consolas" w:hAnsi="Consolas"/>
+                <w:color w:val="2A3831"/>
+                <w:sz w:val="18"/>
+              </w:rPr>
+              <w:t>neu du_lieu_da_du_lon and tuoi_mo_hinh_cu &lt; 7_ngay:</w:t>
+            </w:r>
+            <w:r>
+              <w:rPr>
+                <w:rFonts w:ascii="Consolas" w:hAnsi="Consolas"/>
+                <w:color w:val="2A3831"/>
+                <w:sz w:val="18"/>
+              </w:rPr>
+              <w:br/>
+              <w:t xml:space="preserve">    dùng lại mô hình hành vi cộng đồng cũ (không học lại đêm nay)</w:t>
+            </w:r>
+            <w:r>
+              <w:rPr>
+                <w:rFonts w:ascii="Consolas" w:hAnsi="Consolas"/>
+                <w:color w:val="2A3831"/>
+                <w:sz w:val="18"/>
+              </w:rPr>
+              <w:br/>
+              <w:t>nguoc_lai:</w:t>
+            </w:r>
+            <w:r>
+              <w:rPr>
+                <w:rFonts w:ascii="Consolas" w:hAnsi="Consolas"/>
+                <w:color w:val="2A3831"/>
+                <w:sz w:val="18"/>
+              </w:rPr>
+              <w:br/>
+              <w:t xml:space="preserve">    học lại từ đầu, thay thế mô hình cũ bằng mô hình mới (chuyển giao trọn vẹn, không nửa vời)</w:t>
+            </w:r>
+          </w:p>
+        </w:tc>
+      </w:tr>
+    </w:tbl>
+    <w:p>
+      <w:pPr/>
+    </w:p>
+    <w:p>
+      <w:pPr>
+        <w:pStyle w:val="Heading3"/>
+      </w:pPr>
+      <w:r>
+        <w:t>Bước 8 — Kết nối hệ thống backend: gửi kèm mã khách/mã phiên ở mọi vị trí</w:t>
+      </w:r>
+    </w:p>
+    <w:p>
+      <w:pPr/>
+      <w:r>
+        <w:t>Cập nhật hệ thống chính (Java) và giao diện web để cả 3 vị trí hiển thị gợi ý (trang chủ, trang chi tiết sản phẩm, giỏ hàng) đều gửi kèm mã khách hàng (nếu đã đăng nhập, đọc từ phiên đăng nhập — không bao giờ tin thông tin do trình duyệt tự gửi lên) và mã phiên truy cập sang dịch vụ gợi ý. Trước đây chỉ trang chủ gửi thông tin này; trang chi tiết sản phẩm và giỏ hàng chưa gửi nên chưa thể áp dụng hành vi cộng đồng/chống nhàm chán cá nhân hoá cho 2 vị trí đó.</w:t>
+      </w:r>
+    </w:p>
+    <w:p>
+      <w:pPr>
+        <w:pStyle w:val="Heading2"/>
+      </w:pPr>
+      <w:r>
+        <w:t>3. Kiểm thử đã thực hiện</w:t>
+      </w:r>
+    </w:p>
+    <w:p>
+      <w:pPr/>
+      <w:r>
+        <w:t>Phase 2 được kiểm thử qua nhiều tình huống giả lập thực tế, không chỉ kiểm tra từng phần riêng lẻ, để xác nhận mô hình mới hoạt động đúng và không làm hệ thống kém ổn định hơn Phase 1:</w:t>
+      </w:r>
+    </w:p>
+    <w:p>
+      <w:pPr>
+        <w:pStyle w:val="ListBullet"/>
+      </w:pPr>
+      <w:r>
+        <w:rPr>
+          <w:b/>
+        </w:rPr>
+        <w:t xml:space="preserve">Đủ điều kiện bật hành vi cộng đồng: </w:t>
+      </w:r>
+      <w:r>
+        <w:rPr>
+          <w:b w:val="0"/>
+        </w:rPr>
+        <w:t>xác nhận đúng ngưỡng dữ liệu hiện có (58 khách hàng, 228 sản phẩm) đủ điều kiện, mô hình học xong trong 0,28 giây.</w:t>
+      </w:r>
+    </w:p>
+    <w:p>
+      <w:pPr>
+        <w:pStyle w:val="ListBullet"/>
+      </w:pPr>
+      <w:r>
+        <w:rPr>
+          <w:b/>
+        </w:rPr>
+        <w:t xml:space="preserve">Giả lập “chưa đủ dữ liệu”: </w:t>
+      </w:r>
+      <w:r>
+        <w:rPr>
+          <w:b w:val="0"/>
+        </w:rPr>
+        <w:t>nâng ngưỡng yêu cầu vượt xa dữ liệu hiện có → nguồn hành vi cộng đồng tự tắt hoàn toàn, cả 3 vị trí gợi ý vẫn hoạt động bình thường, không phát sinh lỗi nào.</w:t>
+      </w:r>
+    </w:p>
+    <w:p>
+      <w:pPr>
+        <w:pStyle w:val="ListBullet"/>
+      </w:pPr>
+      <w:r>
+        <w:rPr>
+          <w:b/>
+        </w:rPr>
+        <w:t xml:space="preserve">Giả lập chống nhàm chán: </w:t>
+      </w:r>
+      <w:r>
+        <w:rPr>
+          <w:b w:val="0"/>
+        </w:rPr>
+        <w:t>cho 1 danh mục xuất hiện 17 lần liên tiếp mà khách không bấm vào → số sản phẩm cùng danh mục trong lần gợi ý tiếp theo giảm từ 8/8 xuống còn 4/8; sau khi đánh dấu các lần hiển thị đó là “đã bấm vào”, số lượng quay lại đúng 8/8 như ban đầu.</w:t>
+      </w:r>
+    </w:p>
+    <w:p>
+      <w:pPr>
+        <w:pStyle w:val="ListBullet"/>
+      </w:pPr>
+      <w:r>
+        <w:rPr>
+          <w:b/>
+        </w:rPr>
+        <w:t xml:space="preserve">Dịch vụ gợi ý ngừng hoạt động: </w:t>
+      </w:r>
+      <w:r>
+        <w:rPr>
+          <w:b w:val="0"/>
+        </w:rPr>
+        <w:t>tắt hẳn dịch vụ AI, xác nhận cả 3 vị trí hiển thị vẫn trả kết quả trong chưa tới 200 mili-giây (chuyển sang phương án dự phòng), không có lỗi hiển thị cho khách hàng; bật lại dịch vụ thì hệ thống tự động dùng lại gợi ý AI mà không cần khởi động lại bất kỳ thành phần nào.</w:t>
+      </w:r>
+    </w:p>
+    <w:p>
+      <w:pPr>
+        <w:pStyle w:val="ListBullet"/>
+      </w:pPr>
+      <w:r>
+        <w:rPr>
+          <w:b/>
+        </w:rPr>
+        <w:t xml:space="preserve">Kiểm thử trên trình duyệt thật: </w:t>
+      </w:r>
+      <w:r>
+        <w:rPr>
+          <w:b w:val="0"/>
+        </w:rPr>
+        <w:t>khách vãng lai xem trang chủ (gợi ý theo mức phổ biến) → đăng nhập → trang chủ chuyển sang gợi ý theo hành vi cộng đồng → xem trang chi tiết sản phẩm, mục “Sản phẩm tương tự” hiển thị đúng, có sản phẩm đến từ nguồn hành vi cộng đồng. Đối chiếu trực tiếp trong cơ sở dữ liệu xác nhận đúng khách hàng, đúng vị trí hiển thị, đúng nguồn gợi ý được ghi nhận.</w:t>
+      </w:r>
+    </w:p>
+    <w:p>
+      <w:pPr>
+        <w:pStyle w:val="Heading2"/>
+      </w:pPr>
+      <w:r>
+        <w:t>4. Lỗi phát hiện sau khi triển khai và cách khắc phục</w:t>
+      </w:r>
+    </w:p>
+    <w:p>
+      <w:pPr/>
+      <w:r>
+        <w:t>Sau khi Phase 2 lên môi trường thật, người dùng phát hiện 2 vấn đề khi dùng thử giao diện và đối chiếu với kiến thức mua sắm thực tế — không phải qua kiểm thử tự động. Mục này ghi lại nguyên nhân và cách khắc phục để tài liệu phản ánh đúng trạng thái hệ thống hiện tại.</w:t>
+      </w:r>
+    </w:p>
+    <w:p>
+      <w:pPr>
+        <w:pStyle w:val="Heading3"/>
+      </w:pPr>
+      <w:r>
+        <w:t>4.1 Danh sách gợi ý trả về ít hơn số lượng yêu cầu (12 còn 10, giỏ hàng cũng hụt)</w:t>
+      </w:r>
+    </w:p>
+    <w:p>
+      <w:pPr/>
+      <w:r>
+        <w:t>Hiện tượng: trang chủ yêu cầu 12 sản phẩm nhưng đôi khi chỉ nhận được 10; giỏ hàng cũng có thể hụt tương tự.</w:t>
+      </w:r>
+    </w:p>
+    <w:p>
+      <w:pPr/>
+      <w:r>
+        <w:t>Nguyên nhân: nguồn gợi ý theo hành vi cộng đồng (Collaborative Filtering) lấy sản phẩm thẳng từ lịch sử mua/bỏ giỏ/xem mà không lọc lại xem sản phẩm đó còn đang bán và còn hàng hay không — khác với 2 nguồn còn lại (nội dung, phổ biến) đã lọc điều này ngay từ Phase 1. Sản phẩm hết hàng vẫn lọt vào danh sách ứng viên, được chọn vào top kết quả, rồi bị lọc bỏ ở bước cuối cùng (hệ thống chính luôn kiểm tra lại tồn kho mới nhất trước khi trả về khách) — nhưng không có gì bù vào chỗ trống đó, nên danh sách cuối cùng ngắn hơn số lượng đã yêu cầu.</w:t>
+      </w:r>
+    </w:p>
+    <w:tbl>
+      <w:tblPr>
+        <w:tblW w:type="auto" w:w="0"/>
+        <w:tblLook w:firstColumn="1" w:firstRow="1" w:lastColumn="0" w:lastRow="0" w:noHBand="0" w:noVBand="1" w:val="04A0"/>
+        <w:tblLayout w:type="autofit"/>
+      </w:tblPr>
+      <w:tblGrid>
+        <w:gridCol w:w="8640"/>
+      </w:tblGrid>
+      <w:tr>
+        <w:tc>
+          <w:tcPr>
+            <w:tcW w:type="dxa" w:w="8640"/>
+            <w:shd w:val="clear" w:color="auto" w:fill="F3F6F4"/>
+            <w:tcBorders>
+              <w:top w:val="single" w:sz="4" w:space="0" w:color="C7D3CB"/>
+              <w:left w:val="single" w:sz="4" w:space="0" w:color="C7D3CB"/>
+              <w:bottom w:val="single" w:sz="4" w:space="0" w:color="C7D3CB"/>
+              <w:right w:val="single" w:sz="4" w:space="0" w:color="C7D3CB"/>
+            </w:tcBorders>
+          </w:tcPr>
+          <w:p>
+            <w:pPr>
+              <w:spacing w:before="40" w:after="40"/>
+            </w:pPr>
+            <w:r>
+              <w:rPr>
+                <w:rFonts w:ascii="Consolas" w:hAnsi="Consolas"/>
+                <w:color w:val="2A3831"/>
+                <w:sz w:val="18"/>
+              </w:rPr>
+              <w:t># Trước: lấy sản phẩm từ lịch sử mua/xem/bỏ giỏ, không kiểm tra tồn kho hiện tại</w:t>
+            </w:r>
+            <w:r>
+              <w:rPr>
+                <w:rFonts w:ascii="Consolas" w:hAnsi="Consolas"/>
+                <w:color w:val="2A3831"/>
+                <w:sz w:val="18"/>
+              </w:rPr>
+              <w:br/>
+              <w:t>SELECT nguoi_dung, san_pham, thoi_diem FROM lich_su_mua_hang</w:t>
+            </w:r>
+            <w:r>
+              <w:rPr>
+                <w:rFonts w:ascii="Consolas" w:hAnsi="Consolas"/>
+                <w:color w:val="2A3831"/>
+                <w:sz w:val="18"/>
+              </w:rPr>
+              <w:br/>
+              <w:t/>
+            </w:r>
+            <w:r>
+              <w:rPr>
+                <w:rFonts w:ascii="Consolas" w:hAnsi="Consolas"/>
+                <w:color w:val="2A3831"/>
+                <w:sz w:val="18"/>
+              </w:rPr>
+              <w:br/>
+              <w:t># Sau: chỉ tính những sản phẩm hiện còn bán và còn hàng</w:t>
+            </w:r>
+            <w:r>
+              <w:rPr>
+                <w:rFonts w:ascii="Consolas" w:hAnsi="Consolas"/>
+                <w:color w:val="2A3831"/>
+                <w:sz w:val="18"/>
+              </w:rPr>
+              <w:br/>
+              <w:t>SELECT nguoi_dung, san_pham, thoi_diem FROM lich_su_mua_hang</w:t>
+            </w:r>
+            <w:r>
+              <w:rPr>
+                <w:rFonts w:ascii="Consolas" w:hAnsi="Consolas"/>
+                <w:color w:val="2A3831"/>
+                <w:sz w:val="18"/>
+              </w:rPr>
+              <w:br/>
+              <w:t>JOIN san_pham ON con_ban = true AND so_luong_ton &gt; 0</w:t>
+            </w:r>
+          </w:p>
+        </w:tc>
+      </w:tr>
+    </w:tbl>
+    <w:p>
+      <w:pPr/>
+    </w:p>
+    <w:p>
+      <w:pPr/>
+      <w:r>
+        <w:t>Kiểm chứng: quét thử 40 khách hàng, 60 sản phẩm và 30 giỏ hàng ngẫu nhiên, xác nhận không còn trường hợp nào trả về ít hơn số lượng yêu cầu.</w:t>
+      </w:r>
+    </w:p>
+    <w:p>
+      <w:pPr>
+        <w:pStyle w:val="Heading3"/>
+      </w:pPr>
+      <w:r>
+        <w:t>4.2 Vừa mua sản phẩm lại được gợi ý mua thêm ngay sản phẩm giống hệt</w:t>
+      </w:r>
+    </w:p>
+    <w:p>
+      <w:pPr/>
+      <w:r>
+        <w:t>Hiện tượng: khách vừa mua xong một sản phẩm (ví dụ một bao gạo) thì ngay sau đó trang chủ lại ưu tiên gợi ý các sản phẩm cùng loại — trong khi thực tế khách vừa mua xong thì gần như chắc chắn CHƯA cần mua lại ngay.</w:t>
+      </w:r>
+    </w:p>
+    <w:p>
+      <w:pPr/>
+      <w:r>
+        <w:t>Nguyên nhân: mô hình coi “vừa mua” luôn là tín hiệu mạnh nhất rồi mới giảm dần theo thời gian, giống hệt cách xử lý tín hiệu xem/bỏ giỏ — trong khi hành vi mua sắm thật lại theo chiều ngược lại: mức độ “sẵn sàng mua lại” thấp ngay sau khi mua, rồi mới tăng dần lên khi gần tới lúc sản phẩm đã dùng hết. Vấn đề này đã được ghi nhận từ đầu dự án (mục “chu kỳ mua lại” trong nghiên cứu ban đầu) nhưng chưa được xây dựng tới Phase 2 này.</w:t>
+      </w:r>
+    </w:p>
+    <w:tbl>
+      <w:tblPr>
+        <w:tblW w:type="auto" w:w="0"/>
+        <w:tblLook w:firstColumn="1" w:firstRow="1" w:lastColumn="0" w:lastRow="0" w:noHBand="0" w:noVBand="1" w:val="04A0"/>
+        <w:tblLayout w:type="autofit"/>
+      </w:tblPr>
+      <w:tblGrid>
+        <w:gridCol w:w="8640"/>
+      </w:tblGrid>
+      <w:tr>
+        <w:tc>
+          <w:tcPr>
+            <w:tcW w:type="dxa" w:w="8640"/>
+            <w:shd w:val="clear" w:color="auto" w:fill="F3F6F4"/>
+            <w:tcBorders>
+              <w:top w:val="single" w:sz="4" w:space="0" w:color="C7D3CB"/>
+              <w:left w:val="single" w:sz="4" w:space="0" w:color="C7D3CB"/>
+              <w:bottom w:val="single" w:sz="4" w:space="0" w:color="C7D3CB"/>
+              <w:right w:val="single" w:sz="4" w:space="0" w:color="C7D3CB"/>
+            </w:tcBorders>
+          </w:tcPr>
+          <w:p>
+            <w:pPr>
+              <w:spacing w:before="40" w:after="40"/>
+            </w:pPr>
+            <w:r>
+              <w:rPr>
+                <w:rFonts w:ascii="Consolas" w:hAnsi="Consolas"/>
+                <w:color w:val="2A3831"/>
+                <w:sz w:val="18"/>
+              </w:rPr>
+              <w:t># Trước: mua thật luôn là tín hiệu mạnh nhất ngay từ lúc vừa mua, giảm dần sau đó</w:t>
+            </w:r>
+            <w:r>
+              <w:rPr>
+                <w:rFonts w:ascii="Consolas" w:hAnsi="Consolas"/>
+                <w:color w:val="2A3831"/>
+                <w:sz w:val="18"/>
+              </w:rPr>
+              <w:br/>
+              <w:t>trong_so_mua_that = 5.0 * exp(-so_ngay_da_qua * ln2 / 30)</w:t>
+            </w:r>
+            <w:r>
+              <w:rPr>
+                <w:rFonts w:ascii="Consolas" w:hAnsi="Consolas"/>
+                <w:color w:val="2A3831"/>
+                <w:sz w:val="18"/>
+              </w:rPr>
+              <w:br/>
+              <w:t/>
+            </w:r>
+            <w:r>
+              <w:rPr>
+                <w:rFonts w:ascii="Consolas" w:hAnsi="Consolas"/>
+                <w:color w:val="2A3831"/>
+                <w:sz w:val="18"/>
+              </w:rPr>
+              <w:br/>
+              <w:t># Sau: nhân thêm mức độ 'sẵn sàng mua lại' — thấp ngay sau khi mua, tăng dần tới lúc</w:t>
+            </w:r>
+            <w:r>
+              <w:rPr>
+                <w:rFonts w:ascii="Consolas" w:hAnsi="Consolas"/>
+                <w:color w:val="2A3831"/>
+                <w:sz w:val="18"/>
+              </w:rPr>
+              <w:br/>
+              <w:t># gần chu kỳ mua lại ước tính của sản phẩm đó (median các lần mua lặp lại trước đây)</w:t>
+            </w:r>
+            <w:r>
+              <w:rPr>
+                <w:rFonts w:ascii="Consolas" w:hAnsi="Consolas"/>
+                <w:color w:val="2A3831"/>
+                <w:sz w:val="18"/>
+              </w:rPr>
+              <w:br/>
+              <w:t>san_sang_mua_lai = min(so_ngay_da_qua / chu_ky_mua_lai_uoc_tinh, 1.0)</w:t>
+            </w:r>
+            <w:r>
+              <w:rPr>
+                <w:rFonts w:ascii="Consolas" w:hAnsi="Consolas"/>
+                <w:color w:val="2A3831"/>
+                <w:sz w:val="18"/>
+              </w:rPr>
+              <w:br/>
+              <w:t>trong_so_mua_that = 5.0 * exp(-so_ngay_da_qua * ln2 / 30) * san_sang_mua_lai</w:t>
+            </w:r>
+          </w:p>
+        </w:tc>
+      </w:tr>
+    </w:tbl>
+    <w:p>
+      <w:pPr/>
+    </w:p>
+    <w:p>
+      <w:pPr/>
+      <w:r>
+        <w:t>Kiểm chứng bằng số liệu thực tế (chu kỳ mua lại ước tính 14 ngày): mua 1 giờ trước → trọng số giảm 100% so với công thức cũ (gần như không còn ảnh hưởng); mua 7 ngày trước (nửa chu kỳ) → giảm 50%; mua từ 14 ngày trở lên (đã qua chu kỳ) → trở lại đúng bằng công thức cũ, không bị ảnh hưởng.</w:t>
       </w:r>
     </w:p>
     <w:sectPr>

</xml_diff>

<commit_message>
Add Phase 3 AI recommendation: LinUCB bandit, conversion attribution, A/B testing, metrics dashboard
Explore-exploit bandit (LinUCB, arms=category) chen 1-2 slot kham pha vao slate sau MMR,
reward update qua polling recommendation_impressions (click/purchase/no-click), state
persist SQLite doc lap voi MySQL. Bo sung conversion attribution con thieu tu truoc (Java
ghi converted khi tao don), A/B cohort qua hash CRC32 khong can cot DB moi, va dashboard
admin do luong CTR/diversity/coverage/entropy.

Co-Authored-By: Claude Sonnet 5 <noreply@anthropic.com>
</commit_message>
<xml_diff>
--- a/recommendation-service/AI_Recommendation_Roadmap.docx
+++ b/recommendation-service/AI_Recommendation_Roadmap.docx
@@ -5817,6 +5817,328 @@
       <w:pPr/>
       <w:r>
         <w:t>Kiểm chứng bằng số liệu thực tế (chu kỳ mua lại ước tính 14 ngày): mua 1 giờ trước → trọng số giảm 100% so với công thức cũ (gần như không còn ảnh hưởng); mua 7 ngày trước (nửa chu kỳ) → giảm 50%; mua từ 14 ngày trở lên (đã qua chu kỳ) → trở lại đúng bằng công thức cũ, không bị ảnh hưởng.</w:t>
+      </w:r>
+    </w:p>
+    <w:p>
+      <w:pPr>
+        <w:pStyle w:val="Heading1"/>
+      </w:pPr>
+      <w:r>
+        <w:t>PHẦN IV — QUY TRÌNH XÂY DỰNG MÔ HÌNH (PHASE 3)</w:t>
+      </w:r>
+    </w:p>
+    <w:p>
+      <w:pPr/>
+      <w:r>
+        <w:t>Phase 3 bổ sung mảnh ghép cuối của vòng lặp tự học: cơ chế khám phá–khai thác (explore–exploit) bằng thuật toán LinUCB, kèm khả năng ghi nhận đơn hàng phát sinh từ gợi ý, thử nghiệm A/B và bộ số liệu đo lường hiển thị ngay trong trang quản trị. Nếu Phase 2 giúp hệ thống hiểu khách qua lịch sử, thì Phase 3 cho phép hệ thống chủ động thử cái mới một cách có kiểm soát và tự điều chỉnh theo phản hồi trong ngày, thay vì chờ tới lượt huấn luyện lại hằng đêm.</w:t>
+      </w:r>
+    </w:p>
+    <w:p>
+      <w:pPr>
+        <w:pStyle w:val="Heading2"/>
+      </w:pPr>
+      <w:r>
+        <w:t>1. Vì sao cần khe "khám phá" và bandit</w:t>
+      </w:r>
+    </w:p>
+    <w:p>
+      <w:pPr/>
+      <w:r>
+        <w:t>Mọi nguồn gợi ý ở Phase 1–2 đều dựa trên những gì khách ĐÃ làm: đã xem gì, đã mua gì, người giống mình mua gì. Điểm mù của cách này là hệ thống không bao giờ biết khách có thích một danh mục hoàn toàn mới hay không, vì danh mục đó chưa từng được hiển thị đủ nhiều để có dữ liệu — hiệu ứng "bong bóng lọc" tự củng cố. Cơ chế chống nhàm chán ở Phase 2 chỉ giảm bớt cái cũ một cách thụ động; Phase 3 chủ động dành 1-2 vị trí trong mỗi danh sách gợi ý (vị trí thứ 3 và thứ 8, tránh ô cuối vì khách ít nhìn tới) cho một sản phẩm thuộc danh mục nằm ngoài vùng quen thuộc.</w:t>
+      </w:r>
+    </w:p>
+    <w:p>
+      <w:pPr/>
+      <w:r>
+        <w:t>Chọn danh mục nào để thử không phải ngẫu nhiên: thuật toán LinUCB cân nhắc giữa "khai thác" (danh mục từng được đón nhận tốt trong bối cảnh tương tự) và "khám phá" (danh mục còn ít dữ liệu nên độ bất định cao — đáng thử để học thêm). Mỗi danh mục là một "cánh tay" của bandit; bối cảnh gồm giờ trong ngày, thứ trong tuần, khách mới hay quen, độ rộng sở thích và mức độ chán hiện tại với chính danh mục đó. Nhờ chiều bối cảnh cuối này, LinUCB tự học được quy luật "danh mục đang bị chán thì thưởng thấp" — không cần viết luật riêng.</w:t>
+      </w:r>
+    </w:p>
+    <w:p>
+      <w:r>
+        <w:drawing>
+          <wp:inline xmlns:a="http://schemas.openxmlformats.org/drawingml/2006/main" xmlns:pic="http://schemas.openxmlformats.org/drawingml/2006/picture">
+            <wp:extent cx="5760720" cy="2852928"/>
+            <wp:docPr id="5" name="Picture 5"/>
+            <wp:cNvGraphicFramePr>
+              <a:graphicFrameLocks noChangeAspect="1"/>
+            </wp:cNvGraphicFramePr>
+            <a:graphic>
+              <a:graphicData uri="http://schemas.openxmlformats.org/drawingml/2006/picture">
+                <pic:pic>
+                  <pic:nvPicPr>
+                    <pic:cNvPr id="0" name="phase3_linucb.png"/>
+                    <pic:cNvPicPr/>
+                  </pic:nvPicPr>
+                  <pic:blipFill>
+                    <a:blip r:embed="rId13"/>
+                    <a:stretch>
+                      <a:fillRect/>
+                    </a:stretch>
+                  </pic:blipFill>
+                  <pic:spPr>
+                    <a:xfrm>
+                      <a:off x="0" y="0"/>
+                      <a:ext cx="5760720" cy="2852928"/>
+                    </a:xfrm>
+                    <a:prstGeom prst="rect"/>
+                  </pic:spPr>
+                </pic:pic>
+              </a:graphicData>
+            </a:graphic>
+          </wp:inline>
+        </w:drawing>
+      </w:r>
+    </w:p>
+    <w:p>
+      <w:pPr>
+        <w:pStyle w:val="Caption"/>
+      </w:pPr>
+      <w:r>
+        <w:t>Sơ đồ 6 — Cách LinUCB quyết định thử danh mục nào cho khe khám phá</w:t>
+      </w:r>
+    </w:p>
+    <w:p>
+      <w:pPr>
+        <w:pStyle w:val="Heading2"/>
+      </w:pPr>
+      <w:r>
+        <w:t>2. Vòng lặp phần thưởng — học ngay trong ngày</w:t>
+      </w:r>
+    </w:p>
+    <w:p>
+      <w:pPr/>
+      <w:r>
+        <w:t>Khác với các nguồn gợi ý huấn luyện lại hằng đêm, bandit cập nhật gần như tức thời: một tác vụ nền đọc bảng lượt hiển thị mỗi 2 phút (đúng chủ trương trong roadmap — không thêm message broker ở quy mô hiện tại) và quy đổi phản hồi của khách thành phần thưởng:</w:t>
+      </w:r>
+    </w:p>
+    <w:p>
+      <w:pPr>
+        <w:pStyle w:val="ListBullet"/>
+      </w:pPr>
+      <w:r>
+        <w:t>Khách bấm vào sản phẩm khám phá: +0.2 — tín hiệu quan tâm.</w:t>
+      </w:r>
+    </w:p>
+    <w:p>
+      <w:pPr>
+        <w:pStyle w:val="ListBullet"/>
+      </w:pPr>
+      <w:r>
+        <w:t>Khách đặt hàng sản phẩm đó (trong cửa sổ 7 ngày): +1.0 — tín hiệu mạnh nhất.</w:t>
+      </w:r>
+    </w:p>
+    <w:p>
+      <w:pPr>
+        <w:pStyle w:val="ListBullet"/>
+      </w:pPr>
+      <w:r>
+        <w:t>Hiển thị hơn 24 giờ mà không được bấm: −0.05 — tín hiệu chán, cố ý để nhẹ hơn nhiều so với mức −0.5 dự kiến ban đầu vì giao diện không có nút "bỏ qua" rõ ràng, và mức phạt lớn sẽ nhấn chìm tín hiệu bấm (+0.2) khi tỉ lệ bấm nền chỉ khoảng 4%.</w:t>
+      </w:r>
+    </w:p>
+    <w:p>
+      <w:pPr>
+        <w:pStyle w:val="ListBullet"/>
+      </w:pPr>
+      <w:r>
+        <w:t>Danh sách chưa từng hiện ra trên màn hình khách (chưa cuộn tới) sau 6 giờ: bỏ qua, không thưởng không phạt — chưa nhìn thấy thì không phải phản hồi.</w:t>
+      </w:r>
+    </w:p>
+    <w:p>
+      <w:pPr/>
+      <w:r>
+        <w:t>Trạng thái học của bandit (ma trận từng cánh tay + nhật ký quyết định chờ phần thưởng) được lưu trong một file SQLite cục bộ của dịch vụ Python — dịch vụ khởi động lại không mất kiến thức đã học, và giữ nguyên nguyên tắc "Python chỉ đọc MySQL, mọi thao tác ghi đi qua Java". Mất file này chỉ khiến bandit học lại từ đầu, không mất dữ liệu nghiệp vụ.</w:t>
+      </w:r>
+    </w:p>
+    <w:p>
+      <w:r>
+        <w:drawing>
+          <wp:inline xmlns:a="http://schemas.openxmlformats.org/drawingml/2006/main" xmlns:pic="http://schemas.openxmlformats.org/drawingml/2006/picture">
+            <wp:extent cx="5760720" cy="3072384"/>
+            <wp:docPr id="6" name="Picture 6"/>
+            <wp:cNvGraphicFramePr>
+              <a:graphicFrameLocks noChangeAspect="1"/>
+            </wp:cNvGraphicFramePr>
+            <a:graphic>
+              <a:graphicData uri="http://schemas.openxmlformats.org/drawingml/2006/picture">
+                <pic:pic>
+                  <pic:nvPicPr>
+                    <pic:cNvPr id="0" name="phase3_pipeline.png"/>
+                    <pic:cNvPicPr/>
+                  </pic:nvPicPr>
+                  <pic:blipFill>
+                    <a:blip r:embed="rId14"/>
+                    <a:stretch>
+                      <a:fillRect/>
+                    </a:stretch>
+                  </pic:blipFill>
+                  <pic:spPr>
+                    <a:xfrm>
+                      <a:off x="0" y="0"/>
+                      <a:ext cx="5760720" cy="3072384"/>
+                    </a:xfrm>
+                    <a:prstGeom prst="rect"/>
+                  </pic:spPr>
+                </pic:pic>
+              </a:graphicData>
+            </a:graphic>
+          </wp:inline>
+        </w:drawing>
+      </w:r>
+    </w:p>
+    <w:p>
+      <w:pPr>
+        <w:pStyle w:val="Caption"/>
+      </w:pPr>
+      <w:r>
+        <w:t>Sơ đồ 5 — Pipeline gợi ý Phase 3 với khe khám phá và vòng lặp phần thưởng</w:t>
+      </w:r>
+    </w:p>
+    <w:p>
+      <w:pPr>
+        <w:pStyle w:val="Heading2"/>
+      </w:pPr>
+      <w:r>
+        <w:t>3. Ghi nhận đơn hàng phát sinh từ gợi ý (conversion)</w:t>
+      </w:r>
+    </w:p>
+    <w:p>
+      <w:pPr/>
+      <w:r>
+        <w:t>Khi rà soát để làm phần thưởng +1.0, phát hiện một khoảng trống tồn tại từ Phase 0: bảng lượt hiển thị có sẵn cột "đã chuyển đổi" nhưng chưa có chỗ nào ghi vào. Phase 3 bổ sung: ngay khi khách đặt đơn thành công (kể cả COD chưa thanh toán — theo quyết định nghiệp vụ: đặt đơn đã là tín hiệu ý định mua, đơn huỷ chấp nhận là nhiễu nhỏ), hệ thống tìm cho mỗi sản phẩm trong đơn đúng MỘT lượt hiển thị gợi ý gần nhất trong 7 ngày (ưu tiên lượt đã được bấm) và đánh dấu kèm mã đơn hàng. Chỉ đánh dấu một lượt duy nhất (last-touch) để không thổi phồng tỉ lệ chuyển đổi. Bước này được đặt sau khi tạo đơn và bọc kín lỗi — dù có trục trặc cũng không bao giờ ảnh hưởng luồng đặt hàng của khách.</w:t>
+      </w:r>
+    </w:p>
+    <w:p>
+      <w:pPr>
+        <w:pStyle w:val="Heading2"/>
+      </w:pPr>
+      <w:r>
+        <w:t>4. Thử nghiệm A/B và bảng số liệu trong trang quản trị</w:t>
+      </w:r>
+    </w:p>
+    <w:p>
+      <w:pPr/>
+      <w:r>
+        <w:t>Để trả lời câu hỏi "bật bandit có thực sự tốt hơn không", khách được chia làm hai nhóm cố định theo mã băm CRC32 của định danh (khách đăng nhập theo mã người dùng, khách vãng lai theo mã phiên): 50% có khe khám phá, 50% không. Cách băm này tính lại được ngay trong SQL khi phân tích nên không cần thêm cột nào vào cơ sở dữ liệu. Trang quản trị có thêm mục "Gợi ý AI" hiển thị:</w:t>
+      </w:r>
+    </w:p>
+    <w:p>
+      <w:pPr>
+        <w:pStyle w:val="ListBullet"/>
+      </w:pPr>
+      <w:r>
+        <w:t>Tỉ lệ bấm (CTR) và tỉ lệ chuyển đổi (CVR) theo từng vị trí hiển thị × nguồn thuật toán — nhìn được ngay nguồn khám phá BANDIT_EXPLORE hoạt động ra sao so với các nguồn còn lại.</w:t>
+      </w:r>
+    </w:p>
+    <w:p>
+      <w:pPr>
+        <w:pStyle w:val="ListBullet"/>
+      </w:pPr>
+      <w:r>
+        <w:t>So sánh trực tiếp hai nhóm A/B kèm mức chênh lệch.</w:t>
+      </w:r>
+    </w:p>
+    <w:p>
+      <w:pPr>
+        <w:pStyle w:val="ListBullet"/>
+      </w:pPr>
+      <w:r>
+        <w:t>Độ đa dạng trong từng danh sách (1 − độ tương đồng trung bình giữa các cặp sản phẩm cùng danh sách).</w:t>
+      </w:r>
+    </w:p>
+    <w:p>
+      <w:pPr>
+        <w:pStyle w:val="ListBullet"/>
+      </w:pPr>
+      <w:r>
+        <w:t>Độ rộng sở thích (entropy) của những gì được hiển thị so với những gì được bấm, theo tuần — phải tăng dần nếu đa dạng hoá có hiệu quả.</w:t>
+      </w:r>
+    </w:p>
+    <w:p>
+      <w:pPr>
+        <w:pStyle w:val="ListBullet"/>
+      </w:pPr>
+      <w:r>
+        <w:t>Độ phủ danh mục hàng: bao nhiêu phần trăm sản phẩm đang bán có ít nhất một lượt được gợi ý trong 30 ngày — chống việc mô hình chỉ xoay quanh vài chục sản phẩm quen.</w:t>
+      </w:r>
+    </w:p>
+    <w:p>
+      <w:pPr>
+        <w:pStyle w:val="ListBullet"/>
+      </w:pPr>
+      <w:r>
+        <w:t>Tỉ lệ hiển thị lặp lại mà không được bấm theo danh mục — phải giảm dần nếu cơ chế chống nhàm chán làm đúng việc.</w:t>
+      </w:r>
+    </w:p>
+    <w:p>
+      <w:pPr/>
+      <w:r>
+        <w:t>Số liệu do dịch vụ Python tính trực tiếp từ cơ sở dữ liệu (có bộ nhớ đệm 5 phút), Java làm cầu nối và khoá quyền quản trị viên; giao diện dùng lại đúng bộ biểu đồ sẵn có của trang tổng quan.</w:t>
+      </w:r>
+    </w:p>
+    <w:p>
+      <w:pPr>
+        <w:pStyle w:val="Heading2"/>
+      </w:pPr>
+      <w:r>
+        <w:t>5. Kiểm chứng trước khi bàn giao</w:t>
+      </w:r>
+    </w:p>
+    <w:p>
+      <w:pPr/>
+      <w:r>
+        <w:t>Toàn bộ Phase 3 được kiểm chứng qua HTTP thật xuyên suốt ba tầng (giả lập đúng hành vi frontend → Java → MySQL → Python), không chỉ qua unit test:</w:t>
+      </w:r>
+    </w:p>
+    <w:p>
+      <w:pPr>
+        <w:pStyle w:val="ListBullet"/>
+      </w:pPr>
+      <w:r>
+        <w:t>Khe khám phá xuất hiện đúng vị trí 3 và 8 với nhóm A/B bật, tuyệt đối không xuất hiện với nhóm tắt; danh sách 6 món chỉ có 1 khe; sản phẩm khám phá xoay vòng chứ không lặp một món.</w:t>
+      </w:r>
+    </w:p>
+    <w:p>
+      <w:pPr>
+        <w:pStyle w:val="ListBullet"/>
+      </w:pPr>
+      <w:r>
+        <w:t>Đủ 4 nhánh của vòng lặp phần thưởng: bấm (+0.2, tiếp tục chờ chuyển đổi), đặt hàng (+1.0, chốt), im lặng quá hạn (−0.05, chốt), chưa hiện ra màn hình (bỏ qua). Khởi động lại dịch vụ xác nhận trạng thái học còn nguyên.</w:t>
+      </w:r>
+    </w:p>
+    <w:p>
+      <w:pPr>
+        <w:pStyle w:val="ListBullet"/>
+      </w:pPr>
+      <w:r>
+        <w:t>Đặt một đơn COD thật chứa sản phẩm từng được gợi ý: lượt hiển thị tương ứng được đánh dấu chuyển đổi kèm đúng mã đơn; sản phẩm không có lượt hiển thị nào thì không dòng nào bị đánh dấu.</w:t>
+      </w:r>
+    </w:p>
+    <w:p>
+      <w:pPr>
+        <w:pStyle w:val="ListBullet"/>
+      </w:pPr>
+      <w:r>
+        <w:t>Khép kín vòng lặp thật: bấm vào sản phẩm khám phá trên đường đi thật của frontend → chưa đầy 2 phút sau nhật ký dịch vụ ghi nhận phần thưởng và ma trận cánh tay được cập nhật.</w:t>
+      </w:r>
+    </w:p>
+    <w:p>
+      <w:pPr>
+        <w:pStyle w:val="ListBullet"/>
+      </w:pPr>
+      <w:r>
+        <w:t>Trang số liệu: không đăng nhập bị chặn 401, tài khoản thường bị chặn, quản trị viên xem đủ 6 khối số liệu.</w:t>
+      </w:r>
+    </w:p>
+    <w:p>
+      <w:pPr/>
+      <w:r>
+        <w:t>Công tắc an toàn: đặt BANDIT_ENABLED=false hoặc AB_BANDIT_PCT=0 trong file cấu hình của dịch vụ Python là toàn bộ cơ chế khám phá tắt ngay, hệ thống quay về đúng hành vi Phase 2 — không cần sửa code hay triển khai lại.</w:t>
+      </w:r>
+    </w:p>
+    <w:p>
+      <w:pPr/>
+      <w:r>
+        <w:t>Lưu ý về dữ liệu: Phase 3 đang chạy trên dữ liệu mẫu được bơm sẵn để đạt ngưỡng (8 tuần × ~2.600 lượt hiển thị nguồn AI mỗi tuần, 230 lượt chuyển đổi neo vào đơn hàng thật) nhằm kiểm tra khả năng dự đoán trước. Khi chuyển sang dữ liệu thật, xoá dữ liệu mẫu bằng script dọn dẹp kèm manifest TRƯỚC khi bắt đầu tin các con số của bandit, vì trong thời gian thử nghiệm bandit học trên phản hồi của dữ liệu mẫu.</w:t>
       </w:r>
     </w:p>
     <w:sectPr>

</xml_diff>